<commit_message>
Update lần 3 02/05/2026
</commit_message>
<xml_diff>
--- a/Docs/KLTN2026_Nhom35/0.Mở đầu.docx
+++ b/Docs/KLTN2026_Nhom35/0.Mở đầu.docx
@@ -1559,7 +1559,16 @@
           <w:sz w:val="26"/>
           <w:szCs w:val="26"/>
         </w:rPr>
-        <w:t>Tôi xin cam đoan:</w:t>
+        <w:t>Em</w:t>
+      </w:r>
+      <w:r>
+        <w:rPr>
+          <w:rFonts w:ascii="Times New Roman" w:hAnsi="Times New Roman" w:cs="Times New Roman"/>
+          <w:i/>
+          <w:sz w:val="26"/>
+          <w:szCs w:val="26"/>
+        </w:rPr>
+        <w:t xml:space="preserve"> xin cam đoan:</w:t>
       </w:r>
     </w:p>
     <w:p>
@@ -1584,7 +1593,7 @@
           <w:sz w:val="26"/>
           <w:szCs w:val="26"/>
         </w:rPr>
-        <w:t xml:space="preserve">Những nội dung trong luận văn này là do tôi thực hiện dưới sự hướng dẫn trực tiếp của thầy </w:t>
+        <w:t xml:space="preserve">Những nội dung trong luận văn này là do </w:t>
       </w:r>
       <w:r>
         <w:rPr>
@@ -1593,6 +1602,24 @@
           <w:sz w:val="26"/>
           <w:szCs w:val="26"/>
         </w:rPr>
+        <w:t>em</w:t>
+      </w:r>
+      <w:r>
+        <w:rPr>
+          <w:rFonts w:ascii="Times New Roman" w:hAnsi="Times New Roman" w:cs="Times New Roman"/>
+          <w:i/>
+          <w:sz w:val="26"/>
+          <w:szCs w:val="26"/>
+        </w:rPr>
+        <w:t xml:space="preserve"> thực hiện dưới sự hướng dẫn trực tiếp của thầy </w:t>
+      </w:r>
+      <w:r>
+        <w:rPr>
+          <w:rFonts w:ascii="Times New Roman" w:hAnsi="Times New Roman" w:cs="Times New Roman"/>
+          <w:i/>
+          <w:sz w:val="26"/>
+          <w:szCs w:val="26"/>
+        </w:rPr>
         <w:t xml:space="preserve">ThS. </w:t>
       </w:r>
       <w:r>
@@ -1602,7 +1629,7 @@
           <w:sz w:val="26"/>
           <w:szCs w:val="26"/>
         </w:rPr>
-        <w:t>Nguyễn Minh Nhật</w:t>
+        <w:t>Nguyễn Thanh Trung</w:t>
       </w:r>
     </w:p>
     <w:p>
@@ -1652,7 +1679,25 @@
           <w:sz w:val="26"/>
           <w:szCs w:val="26"/>
         </w:rPr>
-        <w:t>Mọi sao chép không hợp lệ, vi phạm quy chế đào tạo, hay gian trá, tôi xin chịu hoàn toàn trách nhiệm</w:t>
+        <w:t xml:space="preserve">Mọi sao chép không hợp lệ, vi phạm quy chế đào tạo, hay gian trá, </w:t>
+      </w:r>
+      <w:r>
+        <w:rPr>
+          <w:rFonts w:ascii="Times New Roman" w:hAnsi="Times New Roman" w:cs="Times New Roman"/>
+          <w:i/>
+          <w:sz w:val="26"/>
+          <w:szCs w:val="26"/>
+        </w:rPr>
+        <w:t>em</w:t>
+      </w:r>
+      <w:r>
+        <w:rPr>
+          <w:rFonts w:ascii="Times New Roman" w:hAnsi="Times New Roman" w:cs="Times New Roman"/>
+          <w:i/>
+          <w:sz w:val="26"/>
+          <w:szCs w:val="26"/>
+        </w:rPr>
+        <w:t xml:space="preserve"> xin chịu hoàn toàn trách nhiệm</w:t>
       </w:r>
     </w:p>
     <w:p>

</xml_diff>